<commit_message>
docs: align student planning source of truth
</commit_message>
<xml_diff>
--- a/00_공모전/student_aid_consumption_smoothing_ai_service_design.docx
+++ b/00_공모전/student_aid_consumption_smoothing_ai_service_design.docx
@@ -287,7 +287,7 @@
                 <w:color w:val="222222"/>
                 <w:sz w:val="18"/>
               </w:rPr>
-              <w:t>2026-08-27</w:t>
+              <w:t>2026-08-30</w:t>
             </w:r>
           </w:p>
         </w:tc>
@@ -424,7 +424,7 @@
           <w:color w:val="222222"/>
           <w:sz w:val="21"/>
         </w:rPr>
-        <w:t>성과는 대출액 증가가 아니라 발견한 장학금, 근로시간 감소 가능분, 총지출 격차 감소, 상환 안전성, 추천 이해도로 측정한다.</w:t>
+        <w:t>성과는 대출액 증가가 아니라 확인 가능한 지원사업, 근로시간 감소 가능분, 총지출 격차 감소, 상환 안전성, 계획 이해도로 측정한다.</w:t>
       </w:r>
     </w:p>
     <w:p>
@@ -440,7 +440,7 @@
           <w:color w:val="222222"/>
           <w:sz w:val="21"/>
         </w:rPr>
-        <w:t>한국장학재단을 범위로 선택하면 해당 학기 국내 학부생 대상 공개 지원사업 전체를 목록에 포함한다.</w:t>
+        <w:t>공모전 MVP는 검수한 대표 지원사업을 목록화하고 데이터 범위와 누락 가능성을 명시한다. 전체 목록은 검증된 정책 데이터가 확보된 뒤 확장한다.</w:t>
       </w:r>
     </w:p>
     <w:p>
@@ -472,7 +472,7 @@
           <w:color w:val="222222"/>
           <w:sz w:val="21"/>
         </w:rPr>
-        <w:t>규칙엔진이 자격 후보를 계산하고 최적화 엔진이 조합을 산출하며, AI는 공고 구조화와 설명을 담당한다.</w:t>
+        <w:t>규칙엔진이 자격 후보를 계산하고 계산 엔진이 확정 금액·근로·대출 조합을 산출하며, AI는 공고 구조화와 설명을 담당한다.</w:t>
       </w:r>
     </w:p>
     <w:p>
@@ -1422,7 +1422,7 @@
           <w:color w:val="2E5B88"/>
           <w:sz w:val="26"/>
         </w:rPr>
-        <w:t>1.2 최적화의 목적과 제약</w:t>
+        <w:t>1.2 계획 비교의 목적과 제약</w:t>
       </w:r>
     </w:p>
     <w:p>
@@ -1496,7 +1496,7 @@
           <w:color w:val="222222"/>
           <w:sz w:val="21"/>
         </w:rPr>
-        <w:t>장학금 미선정, 취업 6·12개월 지연, 초봉 20% 감소, 휴학·졸업 지연을 스트레스 테스트한다.</w:t>
+        <w:t>취업 6·12개월 지연, 초봉 20% 감소, 휴학·졸업 지연을 스트레스 테스트한다.</w:t>
       </w:r>
     </w:p>
     <w:p>
@@ -1513,6 +1513,34 @@
           <w:sz w:val="21"/>
         </w:rPr>
         <w:t>필수생활비 또는 사용자가 정한 상환 안전선을 침범하는 고대출안은 추천하지 않는다.</w:t>
+      </w:r>
+    </w:p>
+    <w:p>
+      <w:pPr>
+        <w:pStyle w:val="Heading2"/>
+      </w:pPr>
+      <w:r>
+        <w:t>1.3 현행 계산 경계</w:t>
+      </w:r>
+    </w:p>
+    <w:p>
+      <w:r>
+        <w:t>학기당 등록금은 확정 장학금·감면 반영 후 실제 납부액으로 입력하고, 졸업 전 수혜가 확정된 생활비성 지원금만 총필요자금에서 차감한다. 지원사업 후보와 금액 미확인 제도는 계산에 자동 반영하지 않는다.</w:t>
+      </w:r>
+    </w:p>
+    <w:p>
+      <w:r>
+        <w:t>졸업까지 남은 기간은 0.5년 단위로 입력받아 학기 수, 생활 개월, 근로소득, 학기별 대출 실행과 재학 중 이자 계산에 공통 적용한다.</w:t>
+      </w:r>
+    </w:p>
+    <w:p>
+      <w:r>
+        <w:t>대출 유형은 취업 후 상환과 일반 상환 중 하나를 선택한다. 일반 상환은 거치·상환기간과 상환방식을 적용하고, 취업 후 상환은 기준연도·상환기준소득·의무상환율이 있을 때만 예상 의무상환액을 계산한다.</w:t>
+      </w:r>
+    </w:p>
+    <w:p>
+      <w:r>
+        <w:t>균형형은 초기 기본 보기일 뿐 추천 결과가 아니며, 사용자가 선택한 시나리오가 비교 그래프·상세·위험 조건에 일관되게 반영된다.</w:t>
       </w:r>
     </w:p>
     <w:p>
@@ -1691,7 +1719,7 @@
                 <w:color w:val="222222"/>
                 <w:sz w:val="18"/>
               </w:rPr>
-              <w:t>한국장학재단 전체 목록과 대표 교내·지역 후보, 매칭·제외 이유</w:t>
+              <w:t>공개된 대표 지원사업 카탈로그의 후보, 데이터 범위와 매칭·제외 이유</w:t>
             </w:r>
           </w:p>
         </w:tc>
@@ -1743,7 +1771,7 @@
                 <w:color w:val="222222"/>
                 <w:sz w:val="18"/>
               </w:rPr>
-              <w:t>장학금 적용 후 총필요자금과 기간별 자금격차</w:t>
+              <w:t>실제 납부 등록금·확정 지원금 반영 후 총필요자금과 기간별 자금격차</w:t>
             </w:r>
           </w:p>
         </w:tc>
@@ -1899,7 +1927,7 @@
                 <w:color w:val="222222"/>
                 <w:sz w:val="18"/>
               </w:rPr>
-              <w:t>취업지연·초봉하락·장학금 미선정 시나리오</w:t>
+              <w:t>취업지연·초봉하락·졸업지연 시나리오</w:t>
             </w:r>
           </w:p>
         </w:tc>
@@ -2287,7 +2315,7 @@
                 <w:color w:val="222222"/>
                 <w:sz w:val="18"/>
               </w:rPr>
-              <w:t>4. 전체 지원사업</w:t>
+              <w:t>4. 지원사업 후보</w:t>
             </w:r>
           </w:p>
         </w:tc>
@@ -2312,7 +2340,7 @@
                 <w:color w:val="222222"/>
                 <w:sz w:val="18"/>
               </w:rPr>
-              <w:t>한국장학재단 전체 목록에서 자동매칭·추가심사·정보부족·대상아님·모집종료를 구분한다.</w:t>
+              <w:t>검수한 대표 지원사업에서 자동매칭·추가심사·정보부족·대상아님·모집종료를 구분하고 데이터 범위를 공개한다.</w:t>
             </w:r>
           </w:p>
         </w:tc>
@@ -2468,7 +2496,7 @@
                 <w:color w:val="222222"/>
                 <w:sz w:val="18"/>
               </w:rPr>
-              <w:t>장학금 미선정·취업 지연·초봉 감소·졸업 지연을 즉시 재계산한다.</w:t>
+              <w:t>취업 지연·초봉 감소·졸업 지연을 즉시 재계산한다.</w:t>
             </w:r>
           </w:p>
         </w:tc>
@@ -2558,7 +2586,7 @@
           <w:color w:val="222222"/>
           <w:sz w:val="21"/>
         </w:rPr>
-        <w:t>장학금: 확정이 아니라 조건상 후보 금액과 판정 신뢰도</w:t>
+        <w:t>지원사업: 후보 상태·판정 근거·금액 확인 여부. 후보 금액은 계획 계산에서 차감하지 않음</w:t>
       </w:r>
     </w:p>
     <w:p>
@@ -2606,7 +2634,7 @@
           <w:color w:val="222222"/>
           <w:sz w:val="21"/>
         </w:rPr>
-        <w:t>부채: 상품별 원금, 금리, 총이자, 상환개시, 월 상환액</w:t>
+        <w:t>부채: 유형별 원금, 졸업 시 잔액, 상환개시 조건과 예상 상환액. 총이자는 계산 가능한 유형에만 표시</w:t>
       </w:r>
     </w:p>
     <w:p>
@@ -3380,7 +3408,7 @@
                 <w:color w:val="222222"/>
                 <w:sz w:val="20"/>
               </w:rPr>
-              <w:t>해당 학기 국내 학부생 대상 한국장학재단 공개 지원사업 전체를 목록에 포함한다. 자동 판정이 어려운 사업도 숨기지 않고 추가심사 필요 또는 정보 부족 상태로 노출한다.</w:t>
+              <w:t>MVP는 검수한 대표 지원사업 범위와 최종 확인일을 공개한다. 자동 판정이 어려운 사업도 숨기지 않고 추가심사 필요 또는 정보 부족 상태로 노출하며, 전체 사업 보유를 주장하지 않는다.</w:t>
             </w:r>
           </w:p>
         </w:tc>
@@ -3484,7 +3512,7 @@
           <w:color w:val="222222"/>
           <w:sz w:val="21"/>
         </w:rPr>
-        <w:t>추천 결과에서 전체 지원사업 보기와 제외 이유를 제공한다.</w:t>
+        <w:t>계획 결과에서 지원사업 후보 목록, 데이터 범위와 제외 이유를 제공한다.</w:t>
       </w:r>
     </w:p>
     <w:p>
@@ -5375,7 +5403,7 @@
           <w:color w:val="2E5B88"/>
           <w:sz w:val="32"/>
         </w:rPr>
-        <w:t>7. AI·규칙엔진·최적화엔진의 역할</w:t>
+        <w:t>7. AI·규칙엔진·계산엔진의 역할</w:t>
       </w:r>
     </w:p>
     <w:tbl>
@@ -5731,7 +5759,7 @@
                 <w:color w:val="222222"/>
                 <w:sz w:val="18"/>
               </w:rPr>
-              <w:t>시나리오 생성</w:t>
+              <w:t>시나리오 계산</w:t>
             </w:r>
           </w:p>
         </w:tc>
@@ -5756,7 +5784,7 @@
                 <w:color w:val="222222"/>
                 <w:sz w:val="18"/>
               </w:rPr>
-              <w:t>최적화엔진</w:t>
+              <w:t>계산엔진</w:t>
             </w:r>
           </w:p>
         </w:tc>
@@ -5781,7 +5809,7 @@
                 <w:color w:val="222222"/>
                 <w:sz w:val="18"/>
               </w:rPr>
-              <w:t>장학금·근로·대출 조합과 제약조건 계산</w:t>
+              <w:t>확정 금액·근로·대출 조합과 제약조건 계산</w:t>
             </w:r>
           </w:p>
         </w:tc>
@@ -5989,7 +6017,7 @@
           <w:color w:val="222222"/>
           <w:sz w:val="21"/>
         </w:rPr>
-        <w:t>사용자별 추천은 동일한 숫자라도 생활·학업·부채 우선순위에 따라 설명이 달라야 한다.</w:t>
+        <w:t>사용자가 선택한 계획은 동일한 숫자라도 생활·학업·부채 우선순위에 따라 설명이 달라야 한다.</w:t>
       </w:r>
     </w:p>
     <w:p>
@@ -6102,7 +6130,7 @@
           <w:color w:val="2E5B88"/>
           <w:sz w:val="32"/>
         </w:rPr>
-        <w:t>8. 추천 결과와 위험 시나리오</w:t>
+        <w:t>8. 계획 비교 결과와 위험 시나리오</w:t>
       </w:r>
     </w:p>
     <w:p>
@@ -6187,7 +6215,7 @@
                 <w:color w:val="172033"/>
                 <w:sz w:val="18"/>
               </w:rPr>
-              <w:t>최적화 방향</w:t>
+              <w:t>계획 방향</w:t>
             </w:r>
           </w:p>
         </w:tc>
@@ -6368,7 +6396,7 @@
                 <w:color w:val="222222"/>
                 <w:sz w:val="18"/>
               </w:rPr>
-              <w:t>사용자 우선순위에 가장 가까운 기준안</w:t>
+              <w:t>추천이 아닌 초기 비교 기준안</w:t>
             </w:r>
           </w:p>
         </w:tc>
@@ -6773,7 +6801,7 @@
           <w:color w:val="222222"/>
           <w:sz w:val="21"/>
         </w:rPr>
-        <w:t>월 상환액뿐 아니라 총이자·총상환액·상환개시 조건·상환 종료 후 변화를 표시한다.</w:t>
+        <w:t>일반 상환은 첫 납입액·월평균 납입액·총이자를 표시하고, 취업 후 상환은 연간 예상 의무상환액과 월 환산 참고값을 구분해 표시한다.</w:t>
       </w:r>
     </w:p>
     <w:p>
@@ -7308,7 +7336,7 @@
                 <w:color w:val="222222"/>
                 <w:sz w:val="18"/>
               </w:rPr>
-              <w:t>KOSAF 전체 목록</w:t>
+              <w:t>대표 지원사업 카탈로그</w:t>
             </w:r>
           </w:p>
         </w:tc>
@@ -7333,7 +7361,7 @@
                 <w:color w:val="222222"/>
                 <w:sz w:val="18"/>
               </w:rPr>
-              <w:t>대상 학부 지원사업 전체와 상태·출처·기준일</w:t>
+              <w:t>대표 지원사업의 상태·출처·기준일과 데이터 범위</w:t>
             </w:r>
           </w:p>
         </w:tc>
@@ -7537,7 +7565,7 @@
                 <w:color w:val="222222"/>
                 <w:sz w:val="18"/>
               </w:rPr>
-              <w:t>장학금 적용 후 교육비·생활소비 부족분 계산</w:t>
+              <w:t>실제 납부 등록금·확정 지원금 반영 후 교육비·생활소비 부족분 계산</w:t>
             </w:r>
           </w:p>
         </w:tc>
@@ -7741,7 +7769,7 @@
                 <w:color w:val="222222"/>
                 <w:sz w:val="18"/>
               </w:rPr>
-              <w:t>장학금 미선정·취업지연·초봉감소·졸업지연</w:t>
+              <w:t>취업지연·초봉감소·졸업지연</w:t>
             </w:r>
           </w:p>
         </w:tc>
@@ -7843,7 +7871,7 @@
                 <w:color w:val="222222"/>
                 <w:sz w:val="18"/>
               </w:rPr>
-              <w:t>비식별 결과 기반 추천·제외·위험 설명</w:t>
+              <w:t>비식별 결과 기반 선택안·제외·위험 설명</w:t>
             </w:r>
           </w:p>
         </w:tc>
@@ -8244,7 +8272,7 @@
           <w:color w:val="222222"/>
           <w:sz w:val="21"/>
         </w:rPr>
-        <w:t>한국장학재단 전체 목록에서 후보와 제외 이유를 확인한다.</w:t>
+        <w:t>검수한 대표 지원사업 카탈로그에서 후보, 데이터 범위와 제외 이유를 확인한다.</w:t>
       </w:r>
     </w:p>
     <w:p>
@@ -8260,7 +8288,7 @@
           <w:color w:val="222222"/>
           <w:sz w:val="21"/>
         </w:rPr>
-        <w:t>장학금 적용 전후의 자금격차와 세 가지 소비평탄화 시나리오를 비교한다.</w:t>
+        <w:t>실제 납부 등록금과 확정 생활비성 지원금을 반영한 자금격차와 세 가지 소비평탄화 시나리오를 비교한다.</w:t>
       </w:r>
     </w:p>
     <w:p>
@@ -8276,7 +8304,7 @@
           <w:color w:val="222222"/>
           <w:sz w:val="21"/>
         </w:rPr>
-        <w:t>취업 12개월 지연 또는 장학금 미선정을 적용해 결과 변화를 확인한다.</w:t>
+        <w:t>취업 12개월 지연, 초봉 20% 감소 또는 졸업 지연을 적용해 결과 변화를 확인한다.</w:t>
       </w:r>
     </w:p>
     <w:p>
@@ -9179,7 +9207,7 @@
                 <w:color w:val="222222"/>
                 <w:sz w:val="18"/>
               </w:rPr>
-              <w:t>추천안이 필수생활비와 사용자의 안전선을 지켰는가</w:t>
+              <w:t>선택안이 필수생활비와 사용자의 안전선을 지켰는가</w:t>
             </w:r>
           </w:p>
         </w:tc>
@@ -9206,7 +9234,7 @@
                 <w:color w:val="222222"/>
                 <w:sz w:val="18"/>
               </w:rPr>
-              <w:t>추천 이해도</w:t>
+              <w:t>계획 이해도</w:t>
             </w:r>
           </w:p>
         </w:tc>
@@ -9231,7 +9259,7 @@
                 <w:color w:val="222222"/>
                 <w:sz w:val="18"/>
               </w:rPr>
-              <w:t>사용자가 제안된 금액과 이유를 30초 안에 설명할 수 있는가</w:t>
+              <w:t>사용자가 선택한 금액과 이유를 30초 안에 설명할 수 있는가</w:t>
             </w:r>
           </w:p>
         </w:tc>
@@ -9283,7 +9311,7 @@
                 <w:color w:val="222222"/>
                 <w:sz w:val="18"/>
               </w:rPr>
-              <w:t>고위험 필드와 전체 목록의 기준일·검수상태</w:t>
+              <w:t>고위험 필드와 대표 카탈로그의 기준일·검수상태</w:t>
             </w:r>
           </w:p>
         </w:tc>
@@ -9480,7 +9508,7 @@
                 <w:color w:val="222222"/>
                 <w:sz w:val="18"/>
               </w:rPr>
-              <w:t>샘플 마이데이터, 대표 규칙, 전체 목록 구조, 세 시나리오</w:t>
+              <w:t>가상 예시 정보, 대표 규칙과 데이터 범위, 세 시나리오</w:t>
             </w:r>
           </w:p>
         </w:tc>
@@ -9855,7 +9883,7 @@
                 <w:color w:val="222222"/>
                 <w:sz w:val="18"/>
               </w:rPr>
-              <w:t>장학금·근로·대출 통합 최적화와 추천 근거</w:t>
+              <w:t>확정 금액·근로·대출 통합 계산과 선택안 근거</w:t>
             </w:r>
           </w:p>
         </w:tc>
@@ -9907,7 +9935,7 @@
                 <w:color w:val="222222"/>
                 <w:sz w:val="18"/>
               </w:rPr>
-              <w:t>한국장학재단 전체 목록과 규칙 버전 관리</w:t>
+              <w:t>대표 지원사업 카탈로그와 규칙 버전·데이터 범위 관리</w:t>
             </w:r>
           </w:p>
         </w:tc>
@@ -10664,7 +10692,7 @@
           <w:color w:val="222222"/>
           <w:sz w:val="21"/>
         </w:rPr>
-        <w:t>기본 시나리오는 균형형이고 학업시간 확보형·부채 최소형을 함께 비교한다.</w:t>
+        <w:t>초기 기본 보기는 균형형이며 추천 결과가 아니다. 학업시간 확보형·부채 최소형을 동일 지표로 함께 비교한다.</w:t>
       </w:r>
     </w:p>
     <w:sectPr>

</xml_diff>